<commit_message>
Update CV Halyna Lavrik — final version
</commit_message>
<xml_diff>
--- a/CV_Halyna_Lavrik.docx
+++ b/CV_Halyna_Lavrik.docx
@@ -429,7 +429,6 @@
           <w:w w:val="95"/>
           <w:sz w:val="22"/>
           <w:szCs w:val="22"/>
-          <w:lang w:val="fr-CA"/>
         </w:rPr>
       </w:pPr>
       <w:r>
@@ -439,7 +438,6 @@
           <w:w w:val="95"/>
           <w:sz w:val="22"/>
           <w:szCs w:val="22"/>
-          <w:lang w:val="fr-CA"/>
         </w:rPr>
         <w:t>Telegram: @</w:t>
       </w:r>
@@ -451,7 +449,6 @@
           <w:w w:val="95"/>
           <w:sz w:val="22"/>
           <w:szCs w:val="22"/>
-          <w:lang w:val="fr-CA"/>
         </w:rPr>
         <w:t>RadislavaLav</w:t>
       </w:r>
@@ -463,7 +460,6 @@
           <w:w w:val="95"/>
           <w:sz w:val="22"/>
           <w:szCs w:val="22"/>
-          <w:lang w:val="fr-CA"/>
         </w:rPr>
         <w:t xml:space="preserve"> </w:t>
       </w:r>
@@ -479,7 +475,6 @@
           <w:w w:val="95"/>
           <w:sz w:val="22"/>
           <w:szCs w:val="22"/>
-          <w:lang w:val="fr-CA"/>
         </w:rPr>
       </w:pPr>
       <w:r>
@@ -489,7 +484,6 @@
           <w:w w:val="95"/>
           <w:sz w:val="22"/>
           <w:szCs w:val="22"/>
-          <w:lang w:val="fr-CA"/>
         </w:rPr>
         <w:t>LinkedIn: www.linkedin.com/in/lavrikgeo</w:t>
       </w:r>
@@ -517,136 +511,7 @@
           <w:szCs w:val="22"/>
           <w:lang w:val="fr-CA"/>
         </w:rPr>
-        <w:t xml:space="preserve">70 </w:t>
-      </w:r>
-      <w:r>
-        <w:rPr>
-          <w:rFonts w:ascii="Arial Narrow" w:hAnsi="Arial Narrow" w:cstheme="minorHAnsi"/>
-          <w:b/>
-          <w:w w:val="95"/>
-          <w:sz w:val="22"/>
-          <w:szCs w:val="22"/>
-          <w:lang w:val="fr-CA"/>
-        </w:rPr>
-        <w:t>Pl</w:t>
-      </w:r>
-      <w:r>
-        <w:rPr>
-          <w:rFonts w:ascii="Arial Narrow" w:hAnsi="Arial Narrow" w:cstheme="minorHAnsi"/>
-          <w:b/>
-          <w:w w:val="95"/>
-          <w:sz w:val="22"/>
-          <w:szCs w:val="22"/>
-          <w:lang w:val="fr-CA"/>
-        </w:rPr>
-        <w:t>ace</w:t>
-      </w:r>
-      <w:r>
-        <w:rPr>
-          <w:rFonts w:ascii="Arial Narrow" w:hAnsi="Arial Narrow" w:cstheme="minorHAnsi"/>
-          <w:b/>
-          <w:w w:val="95"/>
-          <w:sz w:val="22"/>
-          <w:szCs w:val="22"/>
-          <w:lang w:val="fr-CA"/>
-        </w:rPr>
-        <w:t xml:space="preserve"> des Écorceurs,</w:t>
-      </w:r>
-      <w:r>
-        <w:rPr>
-          <w:rFonts w:ascii="Arial Narrow" w:hAnsi="Arial Narrow" w:cstheme="minorHAnsi"/>
-          <w:b/>
-          <w:w w:val="95"/>
-          <w:sz w:val="22"/>
-          <w:szCs w:val="22"/>
-          <w:lang w:val="fr-CA"/>
-        </w:rPr>
-        <w:t xml:space="preserve"> app</w:t>
-      </w:r>
-      <w:r>
-        <w:rPr>
-          <w:rFonts w:ascii="Arial Narrow" w:hAnsi="Arial Narrow" w:cstheme="minorHAnsi"/>
-          <w:b/>
-          <w:w w:val="95"/>
-          <w:sz w:val="22"/>
-          <w:szCs w:val="22"/>
-          <w:lang w:val="fr-CA"/>
-        </w:rPr>
-        <w:t>t</w:t>
-      </w:r>
-      <w:r>
-        <w:rPr>
-          <w:rFonts w:ascii="Arial Narrow" w:hAnsi="Arial Narrow" w:cstheme="minorHAnsi"/>
-          <w:b/>
-          <w:w w:val="95"/>
-          <w:sz w:val="22"/>
-          <w:szCs w:val="22"/>
-          <w:lang w:val="fr-CA"/>
-        </w:rPr>
-        <w:t>. 202</w:t>
-      </w:r>
-      <w:r>
-        <w:rPr>
-          <w:rFonts w:ascii="Arial Narrow" w:hAnsi="Arial Narrow" w:cstheme="minorHAnsi"/>
-          <w:b/>
-          <w:w w:val="95"/>
-          <w:sz w:val="22"/>
-          <w:szCs w:val="22"/>
-          <w:lang w:val="fr-CA"/>
-        </w:rPr>
-        <w:t xml:space="preserve"> </w:t>
-      </w:r>
-    </w:p>
-    <w:p>
-      <w:pPr>
-        <w:pStyle w:val="a3"/>
-        <w:ind w:left="4910" w:right="564" w:firstLine="567"/>
-        <w:jc w:val="right"/>
-        <w:rPr>
-          <w:rFonts w:ascii="Arial Narrow" w:hAnsi="Arial Narrow" w:cstheme="minorHAnsi"/>
-          <w:b/>
-          <w:w w:val="95"/>
-          <w:sz w:val="22"/>
-          <w:szCs w:val="22"/>
-          <w:lang w:val="fr-CA"/>
-        </w:rPr>
-      </w:pPr>
-      <w:r>
-        <w:rPr>
-          <w:rFonts w:ascii="Arial Narrow" w:hAnsi="Arial Narrow" w:cstheme="minorHAnsi"/>
-          <w:b/>
-          <w:w w:val="95"/>
-          <w:sz w:val="22"/>
-          <w:szCs w:val="22"/>
-          <w:lang w:val="fr-CA"/>
-        </w:rPr>
         <w:t>Chicoutimi, Quebec</w:t>
-      </w:r>
-    </w:p>
-    <w:p>
-      <w:pPr>
-        <w:pStyle w:val="a3"/>
-        <w:ind w:left="4910" w:right="564" w:firstLine="567"/>
-        <w:jc w:val="right"/>
-        <w:rPr>
-          <w:rFonts w:ascii="Arial Narrow" w:hAnsi="Arial Narrow" w:cstheme="minorHAnsi"/>
-          <w:b/>
-          <w:w w:val="95"/>
-          <w:sz w:val="22"/>
-          <w:szCs w:val="22"/>
-          <w:lang w:val="fr-CA"/>
-        </w:rPr>
-      </w:pPr>
-      <w:r>
-        <w:rPr>
-          <w:rFonts w:ascii="Arial Narrow" w:hAnsi="Arial Narrow" w:cstheme="minorHAnsi"/>
-          <w:b/>
-          <w:w w:val="95"/>
-          <w:sz w:val="22"/>
-          <w:szCs w:val="22"/>
-          <w:lang w:val="fr-CA"/>
-        </w:rPr>
-        <w:t>G7H 6P5</w:t>
       </w:r>
     </w:p>
     <w:p>
@@ -741,8 +606,6 @@
         </w:rPr>
         <w:t xml:space="preserve"> vous </w:t>
       </w:r>
-      <w:bookmarkStart w:id="0" w:name="_GoBack"/>
-      <w:bookmarkEnd w:id="0"/>
       <w:r>
         <w:rPr>
           <w:rFonts w:ascii="Times New Roman" w:eastAsia="Times New Roman" w:hAnsi="Times New Roman" w:cs="Times New Roman"/>
@@ -1464,7 +1327,18 @@
           <w:szCs w:val="24"/>
           <w:lang w:val="fr-CA"/>
         </w:rPr>
-        <w:t>• Élaboration de stratégies de contenu et rédaction d’articles SEO pour le blogue du site Web</w:t>
+        <w:t>• Élab</w:t>
+      </w:r>
+      <w:bookmarkStart w:id="0" w:name="_GoBack"/>
+      <w:bookmarkEnd w:id="0"/>
+      <w:r>
+        <w:rPr>
+          <w:rFonts w:ascii="Arial Narrow" w:eastAsia="Times New Roman" w:hAnsi="Arial Narrow" w:cs="Times New Roman"/>
+          <w:sz w:val="24"/>
+          <w:szCs w:val="24"/>
+          <w:lang w:val="fr-CA"/>
+        </w:rPr>
+        <w:t>oration de stratégies de contenu et rédaction d’articles SEO pour le blogue du site Web</w:t>
       </w:r>
     </w:p>
     <w:p>
@@ -2321,16 +2195,7 @@
           <w:szCs w:val="24"/>
           <w:lang w:val="fr-CA"/>
         </w:rPr>
-        <w:t>Collège Électrométallurgique de Donetsk</w:t>
-      </w:r>
-      <w:r>
-        <w:rPr>
-          <w:rFonts w:ascii="Arial Narrow" w:eastAsia="Times New Roman" w:hAnsi="Arial Narrow" w:cs="Times New Roman"/>
-          <w:sz w:val="24"/>
-          <w:szCs w:val="24"/>
-          <w:lang w:val="fr-CA"/>
-        </w:rPr>
-        <w:t xml:space="preserve">, </w:t>
+        <w:t xml:space="preserve">Collège Électrométallurgique de Donetsk, </w:t>
       </w:r>
       <w:r>
         <w:rPr>
@@ -2366,34 +2231,7 @@
           <w:szCs w:val="24"/>
           <w:lang w:val="fr-CA"/>
         </w:rPr>
-        <w:t>me de Technicien</w:t>
-      </w:r>
-      <w:r>
-        <w:rPr>
-          <w:rFonts w:ascii="Arial Narrow" w:eastAsia="Times New Roman" w:hAnsi="Arial Narrow" w:cs="Times New Roman"/>
-          <w:i/>
-          <w:szCs w:val="24"/>
-          <w:lang w:val="fr-CA"/>
-        </w:rPr>
-        <w:t>ne</w:t>
-      </w:r>
-      <w:r>
-        <w:rPr>
-          <w:rFonts w:ascii="Arial Narrow" w:eastAsia="Times New Roman" w:hAnsi="Arial Narrow" w:cs="Times New Roman"/>
-          <w:i/>
-          <w:szCs w:val="24"/>
-          <w:lang w:val="fr-CA"/>
-        </w:rPr>
-        <w:t xml:space="preserve"> en chauffage</w:t>
-      </w:r>
-      <w:r>
-        <w:rPr>
-          <w:rFonts w:ascii="Arial Narrow" w:eastAsia="Times New Roman" w:hAnsi="Arial Narrow" w:cs="Times New Roman"/>
-          <w:i/>
-          <w:szCs w:val="24"/>
-          <w:lang w:val="fr-CA"/>
-        </w:rPr>
-        <w:t xml:space="preserve"> et plomberie</w:t>
+        <w:t>me de Technicienne en chauffage et plomberie</w:t>
       </w:r>
     </w:p>
     <w:p>
@@ -2494,7 +2332,6 @@
           <w:szCs w:val="24"/>
           <w:lang w:val="fr-CA"/>
         </w:rPr>
-        <w:lastRenderedPageBreak/>
         <w:t>​</w:t>
       </w:r>
     </w:p>

</xml_diff>